<commit_message>
Update legal contact email
</commit_message>
<xml_diff>
--- a/public/legal/personal-data-policy.docx
+++ b/public/legal/personal-data-policy.docx
@@ -2521,7 +2521,7 @@
             <w:rStyle w:val="ad"/>
             <w:rFonts w:ascii="Calibri" w:hAnsi="Calibri" w:cs="Calibri"/>
           </w:rPr>
-          <w:t>info@digital-methodology.ru</w:t>
+          <w:t>digital-methodology@ya.ru</w:t>
         </w:r>
       </w:hyperlink>
       <w:r>
@@ -3922,7 +3922,7 @@
             <w:rStyle w:val="ad"/>
             <w:rFonts w:ascii="Calibri" w:hAnsi="Calibri" w:cs="Calibri"/>
           </w:rPr>
-          <w:t>info@digital-methodology.ru</w:t>
+          <w:t>digital-methodology@ya.ru</w:t>
         </w:r>
       </w:hyperlink>
       <w:r>
@@ -4124,7 +4124,7 @@
             <w:rStyle w:val="ad"/>
             <w:rFonts w:ascii="Calibri" w:hAnsi="Calibri" w:cs="Calibri"/>
           </w:rPr>
-          <w:t>info@digital-methodology.ru</w:t>
+          <w:t>digital-methodology@ya.ru</w:t>
         </w:r>
       </w:hyperlink>
       <w:r>
@@ -4851,7 +4851,7 @@
             <w:rStyle w:val="ad"/>
             <w:rFonts w:ascii="Calibri" w:hAnsi="Calibri" w:cs="Calibri"/>
           </w:rPr>
-          <w:t>info@digital-methodology.ru</w:t>
+          <w:t>digital-methodology@ya.ru</w:t>
         </w:r>
       </w:hyperlink>
     </w:p>
@@ -4892,7 +4892,7 @@
             <w:rStyle w:val="ad"/>
             <w:rFonts w:ascii="Calibri" w:hAnsi="Calibri" w:cs="Calibri"/>
           </w:rPr>
-          <w:t>info@digital-methodology.ru</w:t>
+          <w:t>digital-methodology@ya.ru</w:t>
         </w:r>
       </w:hyperlink>
     </w:p>

</xml_diff>